<commit_message>
Readability pass on The Boundary You Can Point To
Split long multi-clause sentences, moved embedded caveats into their
own sentences, and gave each of the three tests its own short opening
line. Average sentence length down from ~28 to ~15 words with no loss
of facts or sourcing. Regenerated the Word export.
</commit_message>
<xml_diff>
--- a/articles/2026-09-05-the-boundary-you-can-point-to.docx
+++ b/articles/2026-09-05-the-boundary-you-can-point-to.docx
@@ -18,17 +18,17 @@
     </w:p>
     <w:p>
       <w:r>
-        <w:t>Running AI on your own hardware stopped being an ideological position sometime in the last eighteen months and became a threshold question with three checkable gates. Most firms are still treating it as a philosophy debate, which is why the decision keeps stalling.</w:t>
+        <w:t>Running AI on your own hardware is no longer a matter of principle. It is a threshold question, and there are three tests. A firm needs only one of them to come back yes. Most firms are still arguing the principle, which is why the decision keeps stalling.</w:t>
       </w:r>
     </w:p>
     <w:p>
       <w:r>
-        <w:t>The gates are independent, and a firm only needs one of them to close to have its answer.</w:t>
+        <w:t>The first test is whether someone has already decided this for you.</w:t>
       </w:r>
     </w:p>
     <w:p>
       <w:r>
-        <w:t>The first gate is whether something external already forces the boundary. This is the one most firms underweight, because it does not feel like a technology decision at all. Roderick Bates, writing in February 2026, made the point that project contracts themselves increasingly restrict how AI tools may process project information, which means the constraint arrives through the commercial team before IT ever sees it (</w:t>
+        <w:t>Firms underweight this one, because it does not arrive looking like a technology decision. Roderick Bates wrote in February 2026 that project contracts increasingly restrict how AI tools may handle project information (</w:t>
       </w:r>
       <w:hyperlink r:id="rId9">
         <w:r>
@@ -40,12 +40,12 @@
         </w:r>
       </w:hyperlink>
       <w:r>
-        <w:t>). His argument is qualitative, with no adoption figures behind it, so I read it as a well placed observation rather than measured evidence.</w:t>
+        <w:t>). Where that is happening, the limit reaches a firm through its commercial team, well before IT hears about it. His piece carries no adoption figures, so I read it as a well placed observation, not as measured evidence.</w:t>
       </w:r>
     </w:p>
     <w:p>
       <w:r>
-        <w:t>Where the constraint is not contractual it can be statutory, and there it is much sharper. Controlled Unclassified Information carries handling requirements under 32 CFR Part 2002 that a general purpose commercial AI tool routing data through external servers does not satisfy. ITAR is stricter still: it restricts transfer of controlled technical data to foreign nationals, and the live question is whether sending that data to a provider whose infrastructure is accessible to non US staff is itself an unlicensed export. The Directorate of Defense Trade Controls has not issued formal guidance on that point, though vendors working in the space expect it inside roughly a year to eighteen months (</w:t>
+        <w:t>Where no contract binds a firm, a regulation might, and those are sharper. Controlled Unclassified Information carries handling rules under 32 CFR Part 2002. A commercial AI tool that routes data through outside servers does not meet them. ITAR goes further. It restricts passing controlled technical data to foreign nationals. So there is an open question: if a provider's staff include non US nationals, does sending them that data count as an unlicensed export on its own? The Directorate of Defense Trade Controls has not ruled on it. Vendors in the space expect guidance within a year to eighteen months (</w:t>
       </w:r>
       <w:hyperlink r:id="rId10">
         <w:r>
@@ -57,12 +57,22 @@
         </w:r>
       </w:hyperlink>
       <w:r>
-        <w:t>). That source is a vendor guide, not the regulator itself, so the timeline is an industry expectation. The underlying regulations are not in doubt. A firm doing defense, nuclear, or certain critical infrastructure work does not get to weigh this against convenience. The gate is already closed and the only question is what it builds inside the boundary.</w:t>
+        <w:t>). That estimate comes from a vendor guide, not from the regulator, so it is an industry expectation and nothing firmer.</w:t>
       </w:r>
     </w:p>
     <w:p>
       <w:r>
-        <w:t>The second gate is volume, and this is where the arithmetic has become unsentimental. Current cost analysis puts the crossover for self hosting at roughly 2 million tokens a day, above which owned hardware wins, and below about 1 million a day, where a hosted API stays cheaper (</w:t>
+        <w:t>The regulations themselves are not in doubt. A firm working on defense, nuclear, or some critical infrastructure has nothing to weigh here. The gate is shut. The only question left is what it builds inside the boundary.</w:t>
+      </w:r>
+    </w:p>
+    <w:p>
+      <w:r>
+        <w:t>The second test is volume, and the arithmetic is blunt.</w:t>
+      </w:r>
+    </w:p>
+    <w:p>
+      <w:r>
+        <w:t>Above roughly 2 million tokens a day, owned hardware wins. Below about 1 million, a hosted service stays cheaper (</w:t>
       </w:r>
       <w:hyperlink r:id="rId11">
         <w:r>
@@ -74,12 +84,22 @@
         </w:r>
       </w:hyperlink>
       <w:r>
-        <w:t>). A single high end consumer GPU runs 3,500 to 4,000 dollars and draws enough power to add roughly 65 dollars a month before anyone touches it. The figure that catches firms out is not hardware at all. It is that the operational cost, meaning a person who can actually run the stack, routinely exceeds the hardware line, and that same analysis notes one deployment can serve several applications at once, which is what pulls the crossover forward for a firm with more than one use case. I am fairly confident in the shape of that curve and much less confident in any specific dollar figure, since GPU street pricing has been unstable and the source is a practitioner guide rather than an audited study.</w:t>
+        <w:t>). A high end consumer GPU costs 3,500 to 4,000 dollars. Power adds about 65 dollars a month before anyone runs a single job on it.</w:t>
       </w:r>
     </w:p>
     <w:p>
       <w:r>
-        <w:t>The third gate used to be the one that ended the conversation, and it is the reason this is worth revisiting now. The capability gap between open weight models a firm can run itself and the proprietary frontier has narrowed to the point where it is no longer the binding constraint for most document and drafting work. One July 2026 comparison put a leading open weight model at 85 percent of a frontier model's composite intelligence score, and another at 95 percent (</w:t>
+        <w:t>Hardware is not the line that catches firms out. Paying someone who can actually run the stack usually costs more than the machines do. Pulling the other way, one deployment can serve several applications at once, which brings the crossover closer for a firm with more than one use for it. I am fairly confident in the shape of that curve. I am much less confident in any single dollar figure, since GPU street prices have been unstable and the source is a practitioner guide, not an audited study.</w:t>
+      </w:r>
+    </w:p>
+    <w:p>
+      <w:r>
+        <w:t>The third test used to end the conversation, and it is why the question is worth reopening now.</w:t>
+      </w:r>
+    </w:p>
+    <w:p>
+      <w:r>
+        <w:t>Open weight models, the ones a firm can run on its own machines, have closed most of the distance to the commercial frontier. A July 2026 comparison put one leading open weight model at 85 percent of a frontier model's composite intelligence score, and another at 95 percent (</w:t>
       </w:r>
       <w:hyperlink r:id="rId12">
         <w:r>
@@ -91,7 +111,12 @@
         </w:r>
       </w:hyperlink>
       <w:r>
-        <w:t>). Several of the underlying coding benchmarks in that comparison are vendor reported, which is a real caveat, and the gap does persist on hard multi step reasoning. For summarizing a specification, checking a document set for inconsistencies, or drafting correspondence, a 5 to 15 percent composite difference is not what determines whether the output is usable. Reviewer time is.</w:t>
+        <w:t>). Some of the coding benchmarks behind that comparison are vendor reported, which is a real caveat, and the gap still shows on hard multi step reasoning.</w:t>
+      </w:r>
+    </w:p>
+    <w:p>
+      <w:r>
+        <w:t>For summarizing a specification, checking a document set for inconsistencies, or drafting correspondence, a 5 to 15 percent difference in composite score is not what decides whether the output is usable. Reviewer time is.</w:t>
       </w:r>
     </w:p>
     <w:p>
@@ -147,7 +172,17 @@
     </w:p>
     <w:p>
       <w:r>
-        <w:t>The benefit that follows from clearing these gates is a governance benefit, and it is worth naming precisely because it gets described too loosely. A hosted arrangement gives a firm a contractual commitment about how data is handled, which is a promise, enforceable after the fact, dependent on the counterparty. A local deployment gives it an architectural fact: the data did not leave, and the firm can demonstrate that from its own network topology instead of a vendor's policy page. Those are different kinds of assurance, and only the second one survives a client who asks to see it instead of being told about it. That distinction matters commercially, since data security now outranks cost as the reported barrier to AI adoption in this sector, cited by 42 percent of technology decision makers against 33 percent for cost and complexity, in a survey of more than 1,000 respondents across five countries (</w:t>
+        <w:t>Clear the gates and the payoff is about governance. It gets described loosely, so it is worth naming exactly.</w:t>
+      </w:r>
+    </w:p>
+    <w:p>
+      <w:r>
+        <w:t>A hosted service gives a firm a contractual commitment about how its data is handled. That is a promise. It is enforceable after the fact and it depends on the other party. A local deployment gives a firm a fact about its own architecture. The data did not leave, and that can be shown from the network itself instead of a vendor's policy page.</w:t>
+      </w:r>
+    </w:p>
+    <w:p>
+      <w:r>
+        <w:t>Those are two different kinds of assurance, and only one of them survives a client who asks to see it. That difference has started to matter commercially. In a survey of more than 1,000 technology decision makers across five countries, 42 percent named data security as the biggest barrier to AI adoption. Cost and complexity came second, at 33 percent (</w:t>
       </w:r>
       <w:hyperlink r:id="rId14">
         <w:r>
@@ -159,12 +194,22 @@
         </w:r>
       </w:hyperlink>
       <w:r>
-        <w:t>). That study was vendor commissioned and not peer reviewed, so I hold the precise split loosely and the ordering more firmly.</w:t>
+        <w:t>). That study was vendor commissioned and not peer reviewed, so I hold the exact split loosely and the ordering more firmly.</w:t>
       </w:r>
     </w:p>
     <w:p>
       <w:r>
-        <w:t>The risk case is straightforward and mostly about who maintains the thing. A local deployment converts a subscription into an asset the firm has to operate, patch, secure, and eventually replace, and it moves model updates from automatic to deliberate. A firm that installs one and then under staffs it ends up with an aging model and a new attack surface, which is worse than what it replaced. There is also a quieter failure: buying hardware to satisfy a governance requirement that a properly negotiated data processing agreement would have satisfied at a fraction of the effort. The first gate exists to catch exactly that, and it is worth checking honestly rather than as a justification written after the purchase order.</w:t>
+        <w:t>The risk is mostly about who maintains the thing.</w:t>
+      </w:r>
+    </w:p>
+    <w:p>
+      <w:r>
+        <w:t>A local deployment turns a subscription into an asset. Someone has to operate it, patch it, secure it, and eventually replace it. Model updates stop being automatic and become a decision. A firm that installs one and then understaffs it ends up with an aging model and a new attack surface, which is worse than what it replaced.</w:t>
+      </w:r>
+    </w:p>
+    <w:p>
+      <w:r>
+        <w:t>There is a quieter failure too. Buying hardware to meet a governance requirement that a well negotiated data processing agreement would have met, for a fraction of the effort. The first test catches that, as long as it gets asked before the purchase order and not after.</w:t>
       </w:r>
     </w:p>
     <w:p>
@@ -174,12 +219,12 @@
     </w:p>
     <w:p>
       <w:r>
-        <w:t>I will put a date on this. By the end of 2027, the Directorate of Defense Trade Controls will have issued formal guidance addressing whether transmitting ITAR controlled technical data to a commercial AI service constitutes an export. Confidence: medium. The question is squarely inside their remit and the industry has been asking it openly for over a year, though regulators routinely take longer than the sector expects.</w:t>
+        <w:t>A date on this. By the end of 2027, the Directorate of Defense Trade Controls will have issued formal guidance on whether sending ITAR controlled technical data to a commercial AI service counts as an export. Confidence: medium. The question sits squarely in their remit and the industry has been asking it openly for over a year. Regulators also routinely take longer than the sector expects.</w:t>
       </w:r>
     </w:p>
     <w:p>
       <w:r>
-        <w:t>What I am watching next is narrower and more useful as a signal: whether client side contract templates start specifying where AI inference must physically occur, rather than only what a supplier may not do with data. The first is an architectural requirement a firm either meets or does not. The second is a clause. Once the first starts appearing in standard terms, the local deployment question stops being a strategy discussion and becomes a bid qualification, and firms will discover which gate they were standing at all along.</w:t>
+        <w:t>What I am watching next is one clause. Whether client contract templates start naming where AI inference must physically happen, and not only what a supplier may not do with the data afterward. The first is a requirement a firm either meets or does not. The second is wording. Once the first shows up in standard terms, running AI in house stops being a strategy discussion and becomes a bid qualification.</w:t>
       </w:r>
     </w:p>
     <w:sectPr>

</xml_diff>

<commit_message>
Carry Lorela's docx edits into markdown; broaden regulation to EU, US, China
Her edits (preconditions, company/companies, commercial & legal team,
revised opening line, cut Bates caveat) were made in the Word file and
are now applied to the markdown as the source of truth, extended
consistently through the later paragraphs she had not reached.

Regulation section rewritten around what each jurisdiction restricts:
Europe whose law reaches the data (Schrems II plus CLOUD Act, residency
is not sovereignty), the US who may see it (ITAR, CUI), China whether it
may leave (PIPL). Adds the EU AI Act Annex III delay to Dec 2027.
Prediction moved from DDTC to an EU data protection authority. Graphic
and Word export regenerated to match.
</commit_message>
<xml_diff>
--- a/articles/2026-09-05-the-boundary-you-can-point-to.docx
+++ b/articles/2026-09-05-the-boundary-you-can-point-to.docx
@@ -18,17 +18,17 @@
     </w:p>
     <w:p>
       <w:r>
-        <w:t>Running AI on your own hardware is no longer a matter of principle. It is a threshold question, and there are three tests. A firm needs only one of them to come back yes. Most firms are still arguing the principle, which is why the decision keeps stalling.</w:t>
+        <w:t>Running AI on your own hardware is no longer a matter of principle. It is a threshold question, and there are three preconditions for it. A company needs only one of them to come back yes. I often see having own hardware being discussed as a philosophical question, which is why the decision keeps stalling.</w:t>
       </w:r>
     </w:p>
     <w:p>
       <w:r>
-        <w:t>The first test is whether someone has already decided this for you.</w:t>
+        <w:t>The first precondition/enabler is whether someone has already decided this for you.</w:t>
       </w:r>
     </w:p>
     <w:p>
       <w:r>
-        <w:t>Firms underweight this one, because it does not arrive looking like a technology decision. Roderick Bates wrote in February 2026 that project contracts increasingly restrict how AI tools may handle project information (</w:t>
+        <w:t>Companies underweight this one, because it does not arrive looking like a technology decision. Roderick Bates wrote in February 2026 that project contracts increasingly restrict how AI tools may handle project information (</w:t>
       </w:r>
       <w:hyperlink r:id="rId9">
         <w:r>
@@ -40,14 +40,65 @@
         </w:r>
       </w:hyperlink>
       <w:r>
-        <w:t>). Where that is happening, the limit reaches a firm through its commercial team, well before IT hears about it. His piece carries no adoption figures, so I read it as a well placed observation, not as measured evidence.</w:t>
+        <w:t>). Where that is happening, the limit reaches a company through its commercial &amp; legal team, well before IT/digital is involved.</w:t>
       </w:r>
     </w:p>
     <w:p>
       <w:r>
-        <w:t>Where no contract binds a firm, a regulation might, and those are sharper. Controlled Unclassified Information carries handling rules under 32 CFR Part 2002. A commercial AI tool that routes data through outside servers does not meet them. ITAR goes further. It restricts passing controlled technical data to foreign nationals. So there is an open question: if a provider's staff include non US nationals, does sending them that data count as an unlicensed export on its own? The Directorate of Defense Trade Controls has not ruled on it. Vendors in the space expect guidance within a year to eighteen months (</w:t>
+        <w:t>Where no contract binds a company, a regulation might, and those are sharper. The three jurisdictions most engineering work touches each restrict something different, which is why a single global answer does not exist.</w:t>
+      </w:r>
+    </w:p>
+    <w:p>
+      <w:r>
+        <w:t>Europe restricts whose law can reach the data, and this is the one European companies most often think they have already solved. Since Schrems II in July 2020, moving personal data out of the EU needs a case by case assessment of the destination country's law, not a signed clause on its own. The Irish Data Protection Commission made that concrete in May 2023, fining Meta 1.2 billion euros: standard contractual clauses without adequate supplementary measures do not cure a US transfer. The US CLOUD Act, meanwhile, reaches subsidiaries of US corporations wherever their servers sit, Frankfurt and Dublin included (</w:t>
       </w:r>
       <w:hyperlink r:id="rId10">
+        <w:r>
+          <w:rPr>
+            <w:color w:val="0563C1"/>
+            <w:u w:val="single"/>
+          </w:rPr>
+          <w:t>DanubeData, digital sovereignty and Schrems II</w:t>
+        </w:r>
+      </w:hyperlink>
+      <w:r>
+        <w:t>). Picking the EU region of a US owned cloud buys residency. It does not buy control of the stack. The EDPB's Recommendations 01/2020 name what closes the gap: encryption keys held only by the exporter or a trusted EU entity, never reachable by the importer.</w:t>
+      </w:r>
+    </w:p>
+    <w:p>
+      <w:r>
+        <w:t>The EU AI Act is the regulation everyone names here, and today it is not the one that binds. The Digital Omnibus package, approved by the Council on 29 June 2026, pushed the high risk obligations under Annex III from August 2026 out to 2 December 2027 (</w:t>
+      </w:r>
+      <w:hyperlink r:id="rId11">
+        <w:r>
+          <w:rPr>
+            <w:color w:val="0563C1"/>
+            <w:u w:val="single"/>
+          </w:rPr>
+          <w:t>Cloud Security Alliance, on the Omnibus delay</w:t>
+        </w:r>
+      </w:hyperlink>
+      <w:r>
+        <w:t>). Only the Article 50 transparency duties held their original date, carrying penalties up to 15 million euros or 3 percent of global turnover (</w:t>
+      </w:r>
+      <w:hyperlink r:id="rId12">
+        <w:r>
+          <w:rPr>
+            <w:color w:val="0563C1"/>
+            <w:u w:val="single"/>
+          </w:rPr>
+          <w:t>Holland &amp; Knight</w:t>
+        </w:r>
+      </w:hyperlink>
+      <w:r>
+        <w:t>). Worth tracking, and not yet what a European company answers for.</w:t>
+      </w:r>
+    </w:p>
+    <w:p>
+      <w:r>
+        <w:t>The United States restricts who may see the data. Controlled Unclassified Information carries handling rules under 32 CFR Part 2002, and a commercial AI tool routing data through outside servers does not meet them. ITAR goes further and restricts passing controlled technical data to foreign nationals. So there is an open question: if a provider's staff include non US nationals, does sending them that data count as an unlicensed export on its own? The Directorate of Defense Trade Controls has not ruled on it. Vendors in the space expect guidance within a year to eighteen months (</w:t>
+      </w:r>
+      <w:hyperlink r:id="rId13">
         <w:r>
           <w:rPr>
             <w:color w:val="0563C1"/>
@@ -57,24 +108,41 @@
         </w:r>
       </w:hyperlink>
       <w:r>
-        <w:t>). That estimate comes from a vendor guide, not from the regulator, so it is an industry expectation and nothing firmer.</w:t>
+        <w:t>), though that estimate comes from a vendor guide and not from the regulator.</w:t>
       </w:r>
     </w:p>
     <w:p>
       <w:r>
-        <w:t>The regulations themselves are not in doubt. A firm working on defense, nuclear, or some critical infrastructure has nothing to weigh here. The gate is shut. The only question left is what it builds inside the boundary.</w:t>
+        <w:t>China restricts whether the data may leave at all. Under the Personal Information Protection Law, a transfer out takes one of three routes: a security assessment by the Cyberspace Administration, certification by an approved body, or a CAC standard contract. Anything covering more than a million individuals, or data classed as important, goes through the security review. The certification route opened on 1 January 2026 for smaller exporters, and 2026 amendments to the Cybersecurity Law raised the penalties (</w:t>
+      </w:r>
+      <w:hyperlink r:id="rId14">
+        <w:r>
+          <w:rPr>
+            <w:color w:val="0563C1"/>
+            <w:u w:val="single"/>
+          </w:rPr>
+          <w:t>China Briefing, cross-border data transfer certification</w:t>
+        </w:r>
+      </w:hyperlink>
+      <w:r>
+        <w:t>).</w:t>
       </w:r>
     </w:p>
     <w:p>
       <w:r>
-        <w:t>The second test is volume, and the arithmetic is blunt.</w:t>
+        <w:t>Three jurisdictions, three mechanisms, one practical consequence for a company working across them: satisfying all of them at once is usually cheapest by not moving the data. For a company on defense, nuclear, or some critical infrastructure work, there is nothing to weigh at all. That one is settled, and the only question left is what gets built inside the boundary.</w:t>
+      </w:r>
+    </w:p>
+    <w:p>
+      <w:r>
+        <w:t>The second precondition is volume, and the arithmetic is blunt.</w:t>
       </w:r>
     </w:p>
     <w:p>
       <w:r>
         <w:t>Above roughly 2 million tokens a day, owned hardware wins. Below about 1 million, a hosted service stays cheaper (</w:t>
       </w:r>
-      <w:hyperlink r:id="rId11">
+      <w:hyperlink r:id="rId15">
         <w:r>
           <w:rPr>
             <w:color w:val="0563C1"/>
@@ -89,19 +157,19 @@
     </w:p>
     <w:p>
       <w:r>
-        <w:t>Hardware is not the line that catches firms out. Paying someone who can actually run the stack usually costs more than the machines do. Pulling the other way, one deployment can serve several applications at once, which brings the crossover closer for a firm with more than one use for it. I am fairly confident in the shape of that curve. I am much less confident in any single dollar figure, since GPU street prices have been unstable and the source is a practitioner guide, not an audited study.</w:t>
+        <w:t>Hardware is not the line that catches companies out. Paying someone who can actually run the stack usually costs more than the machines do. Pulling the other way, one deployment can serve several applications at once, which brings the crossover closer for a company with more than one use for it. I am fairly confident in the shape of that curve. I am much less confident in any single dollar figure, since GPU street prices have been unstable and the source is a practitioner guide, not an audited study.</w:t>
       </w:r>
     </w:p>
     <w:p>
       <w:r>
-        <w:t>The third test used to end the conversation, and it is why the question is worth reopening now.</w:t>
+        <w:t>The third precondition used to end the conversation, and it is why the question is worth reopening now.</w:t>
       </w:r>
     </w:p>
     <w:p>
       <w:r>
-        <w:t>Open weight models, the ones a firm can run on its own machines, have closed most of the distance to the commercial frontier. A July 2026 comparison put one leading open weight model at 85 percent of a frontier model's composite intelligence score, and another at 95 percent (</w:t>
+        <w:t>Open weight models, the ones a company can run on its own machines, have closed most of the distance to the commercial frontier. A July 2026 comparison put one leading open weight model at 85 percent of a frontier model's composite intelligence score, and another at 95 percent (</w:t>
       </w:r>
-      <w:hyperlink r:id="rId12">
+      <w:hyperlink r:id="rId16">
         <w:r>
           <w:rPr>
             <w:color w:val="0563C1"/>
@@ -126,7 +194,7 @@
       <w:r>
         <w:drawing>
           <wp:inline xmlns:a="http://schemas.openxmlformats.org/drawingml/2006/main" xmlns:pic="http://schemas.openxmlformats.org/drawingml/2006/picture">
-            <wp:extent cx="5669280" cy="3134903"/>
+            <wp:extent cx="5669280" cy="3136366"/>
             <wp:docPr id="1" name="Picture 1"/>
             <wp:cNvGraphicFramePr>
               <a:graphicFrameLocks noChangeAspect="1"/>
@@ -139,7 +207,7 @@
                     <pic:cNvPicPr/>
                   </pic:nvPicPr>
                   <pic:blipFill>
-                    <a:blip r:embed="rId13"/>
+                    <a:blip r:embed="rId17"/>
                     <a:stretch>
                       <a:fillRect/>
                     </a:stretch>
@@ -147,7 +215,7 @@
                   <pic:spPr>
                     <a:xfrm>
                       <a:off x="0" y="0"/>
-                      <a:ext cx="5669280" cy="3134903"/>
+                      <a:ext cx="5669280" cy="3136366"/>
                     </a:xfrm>
                     <a:prstGeom prst="rect"/>
                   </pic:spPr>
@@ -167,24 +235,24 @@
           <w:i/>
           <w:sz w:val="18"/>
         </w:rPr>
-        <w:t>Three gates on running AI in house: whether a contract or regulation already fixes where data may go, whether throughput is past the roughly 2 million tokens a day crossover where owned hardware pays off, and whether open-weight models are good enough for the specific task. Each card carries what decides the gate and the catch that firms miss.</w:t>
+        <w:t>Three preconditions for running AI in house. First, obligation: the EU restricts whose law reaches the data, the US restricts who may see it, China restricts whether it may leave at all. Second, volume: break-even sits near 2 million tokens a day, and staffing costs more than the GPUs. Third, capability: open-weight models reached 85 to 95 percent of frontier scores in a July 2026 comparison, so this is rarely the binding constraint now.</w:t>
       </w:r>
     </w:p>
     <w:p>
       <w:r>
-        <w:t>Clear the gates and the payoff is about governance. It gets described loosely, so it is worth naming exactly.</w:t>
+        <w:t>Clear all three and the payoff is about governance. It gets described loosely, so it is worth naming exactly.</w:t>
       </w:r>
     </w:p>
     <w:p>
       <w:r>
-        <w:t>A hosted service gives a firm a contractual commitment about how its data is handled. That is a promise. It is enforceable after the fact and it depends on the other party. A local deployment gives a firm a fact about its own architecture. The data did not leave, and that can be shown from the network itself instead of a vendor's policy page.</w:t>
+        <w:t>A hosted service gives a company a contractual commitment about how its data is handled. That is a promise. It is enforceable after the fact and it depends on the other party. A local deployment gives a company a fact about its own architecture. The data did not leave, and that can be shown from the network itself instead of a vendor's policy page.</w:t>
       </w:r>
     </w:p>
     <w:p>
       <w:r>
         <w:t>Those are two different kinds of assurance, and only one of them survives a client who asks to see it. That difference has started to matter commercially. In a survey of more than 1,000 technology decision makers across five countries, 42 percent named data security as the biggest barrier to AI adoption. Cost and complexity came second, at 33 percent (</w:t>
       </w:r>
-      <w:hyperlink r:id="rId14">
+      <w:hyperlink r:id="rId18">
         <w:r>
           <w:rPr>
             <w:color w:val="0563C1"/>
@@ -204,7 +272,7 @@
     </w:p>
     <w:p>
       <w:r>
-        <w:t>A local deployment turns a subscription into an asset. Someone has to operate it, patch it, secure it, and eventually replace it. Model updates stop being automatic and become a decision. A firm that installs one and then understaffs it ends up with an aging model and a new attack surface, which is worse than what it replaced.</w:t>
+        <w:t>A local deployment turns a subscription into an asset. Someone has to operate it, patch it, secure it, and eventually replace it. Model updates stop being automatic and become a decision. A company that installs one and then understaffs it ends up with an aging model and a new attack surface, which is worse than what it replaced.</w:t>
       </w:r>
     </w:p>
     <w:p>
@@ -219,12 +287,12 @@
     </w:p>
     <w:p>
       <w:r>
-        <w:t>A date on this. By the end of 2027, the Directorate of Defense Trade Controls will have issued formal guidance on whether sending ITAR controlled technical data to a commercial AI service counts as an export. Confidence: medium. The question sits squarely in their remit and the industry has been asking it openly for over a year. Regulators also routinely take longer than the sector expects.</w:t>
+        <w:t>A date on this. By the end of 2027, at least one EU data protection authority will publish guidance addressing whether sending project or personal data to a US owned AI service hosted in an EU region counts as a restricted transfer. Confidence: medium. The question follows directly from Schrems II and the CLOUD Act sitting in contradiction, and European authorities have been active on transfers for years. Regulators also routinely take longer than the sector expects.</w:t>
       </w:r>
     </w:p>
     <w:p>
       <w:r>
-        <w:t>What I am watching next is one clause. Whether client contract templates start naming where AI inference must physically happen, and not only what a supplier may not do with the data afterward. The first is a requirement a firm either meets or does not. The second is wording. Once the first shows up in standard terms, running AI in house stops being a strategy discussion and becomes a bid qualification.</w:t>
+        <w:t>What I am watching next is one clause. Whether client contract templates start naming where AI inference must physically happen, and not only what a supplier may not do with the data afterward. The first is a requirement a company either meets or does not. The second is wording. Once the first shows up in standard terms, running AI in house stops being a strategy discussion and becomes a bid qualification. I am watching the Directorate of Defense Trade Controls on the ITAR question for the same reason: whichever jurisdiction moves first will set the template the others borrow.</w:t>
       </w:r>
     </w:p>
     <w:sectPr>

</xml_diff>